<commit_message>
new: simple booking form UI
</commit_message>
<xml_diff>
--- a/SWI1_Abschlussbericht.docx
+++ b/SWI1_Abschlussbericht.docx
@@ -293,14 +293,26 @@
         </w:rPr>
         <w:t>verbesserungen: breadcrumb groesser, nicht besetzte räume zuoberst listen</w:t>
       </w:r>
-      <w:bookmarkStart w:id="0" w:name="_GoBack"/>
-      <w:bookmarkEnd w:id="0"/>
+    </w:p>
+    <w:p>
+      <w:pPr>
+        <w:rPr>
+          <w:lang w:val="de-CH"/>
+        </w:rPr>
+      </w:pPr>
+      <w:r>
+        <w:rPr>
+          <w:lang w:val="de-CH"/>
+        </w:rPr>
+        <w:t>die ID des raums ist fuer den benutzer nicht relevant</w:t>
+      </w:r>
     </w:p>
     <w:p>
       <w:pPr>
         <w:pStyle w:val="Heading1"/>
       </w:pPr>
       <w:r>
+        <w:lastRenderedPageBreak/>
         <w:t xml:space="preserve">Implementierte </w:t>
       </w:r>
       <w:r>
@@ -567,6 +579,21 @@
         </w:rPr>
         <w:t>- listenerstorage ist bei grossen projekten so nicht wartbar</w:t>
       </w:r>
+    </w:p>
+    <w:p>
+      <w:pPr>
+        <w:rPr>
+          <w:lang w:val="de-CH"/>
+        </w:rPr>
+      </w:pPr>
+      <w:r>
+        <w:rPr>
+          <w:lang w:val="de-CH"/>
+        </w:rPr>
+        <w:t>- nicht crosssidescripting-proof</w:t>
+      </w:r>
+      <w:bookmarkStart w:id="0" w:name="_GoBack"/>
+      <w:bookmarkEnd w:id="0"/>
     </w:p>
     <w:p>
       <w:pPr>

</xml_diff>